<commit_message>
PF2: audit fixes (graph captions, unambiguous prompts, larger graph labels), audit notes, final support files and index
Co-Authored-By: Claude Opus 5.5 <noreply@anthropic.com>
Claude-Session: https://claude.ai/code/session_013Y8PfETWcMLvmUEpCdE8Wq
</commit_message>
<xml_diff>
--- a/support-materials/PF2/PF2_worked_examples.docx
+++ b/support-materials/PF2/PF2_worked_examples.docx
@@ -738,7 +738,17 @@
         <w:t xml:space="preserve">x=π+2kπ</w:t>
       </w:r>
       <w:r>
-        <w:t xml:space="preserve">. Dividing by one half is the same as multiplying by 2, so the graph is stretched and the asymptotes spread out. </w:t>
+        <w:t xml:space="preserve">. Dividing by one half is the same as multiplying by 2, so the graph is stretched and the asymptotes spread out. The answer </w:t>
+      </w:r>
+      <w:r>
+        <w:rPr>
+          <w:i/>
+          <w:iCs/>
+        </w:rPr>
+        <w:t xml:space="preserve">x=2kπ</w:t>
+      </w:r>
+      <w:r>
+        <w:t xml:space="preserve"> uses cosecant's asymptotes. </w:t>
       </w:r>
       <w:r>
         <w:rPr>
@@ -955,7 +965,17 @@
         <w:t xml:space="preserve">2π</w:t>
       </w:r>
       <w:r>
-        <w:t xml:space="preserve"> multiplies by 2 instead of dividing. </w:t>
+        <w:t xml:space="preserve"> multiplies by 2 instead of dividing, and </w:t>
+      </w:r>
+      <w:r>
+        <w:rPr>
+          <w:i/>
+          <w:iCs/>
+        </w:rPr>
+        <w:t xml:space="preserve">π/4</w:t>
+      </w:r>
+      <w:r>
+        <w:t xml:space="preserve"> divides by 2 twice. </w:t>
       </w:r>
       <w:r>
         <w:rPr>
@@ -1182,7 +1202,17 @@
         <w:t xml:space="preserve">(3π)/4</w:t>
       </w:r>
       <w:r>
-        <w:t xml:space="preserve">, and so on. The domain is the open intervals between them. The first answer ignores the 2. The intervals starting at 0 belong to </w:t>
+        <w:t xml:space="preserve">, and so on. The domain is the open intervals between them. The intervals around </w:t>
+      </w:r>
+      <w:r>
+        <w:rPr>
+          <w:i/>
+          <w:iCs/>
+        </w:rPr>
+        <w:t xml:space="preserve">π/2</w:t>
+      </w:r>
+      <w:r>
+        <w:t xml:space="preserve"> ignore the 2. The intervals starting at 0 belong to </w:t>
       </w:r>
       <w:r>
         <w:t xml:space="preserve">cot</w:t>
@@ -1695,7 +1725,17 @@
         <w:t xml:space="preserve">(3π)/2</w:t>
       </w:r>
       <w:r>
-        <w:t xml:space="preserve"> use tangent's asymptotes. </w:t>
+        <w:t xml:space="preserve"> use tangent's asymptotes, and the intervals at </w:t>
+      </w:r>
+      <w:r>
+        <w:rPr>
+          <w:i/>
+          <w:iCs/>
+        </w:rPr>
+        <w:t xml:space="preserve">π</w:t>
+      </w:r>
+      <w:r>
+        <w:t xml:space="preserve"> ignore the one third. </w:t>
       </w:r>
       <w:r>
         <w:rPr>
@@ -1974,7 +2014,17 @@
         <w:t xml:space="preserve">π/2</w:t>
       </w:r>
       <w:r>
-        <w:t xml:space="preserve"> ignore the shift. </w:t>
+        <w:t xml:space="preserve"> ignore the shift, and the intervals at </w:t>
+      </w:r>
+      <w:r>
+        <w:rPr>
+          <w:i/>
+          <w:iCs/>
+        </w:rPr>
+        <w:t xml:space="preserve">π</w:t>
+      </w:r>
+      <w:r>
+        <w:t xml:space="preserve"> use cotangent's asymptotes. </w:t>
       </w:r>
       <w:r>
         <w:rPr>
@@ -2048,9 +2098,9 @@
       <w:r>
         <w:drawing>
           <wp:inline distT="0" distB="0" distL="0" distR="0">
-            <wp:extent cx="3609975" cy="2476500"/>
+            <wp:extent cx="3676650" cy="2476500"/>
             <wp:effectExtent t="0" r="0" b="0" l="0"/>
-            <wp:docPr id="1" name="graph1" descr="A repeating curve between dashed vertical lines. Plotted data: dashed vertical lines at x = −3π/4, π/4, and 5π/4, spaced π apart. Between each pair of neighboring dashed lines, the curve rises from the bottom of the grid to the top, getting very close to the dashed lines at both ends. It crosses the x-axis at (−π/4, 0) and (3π/4, 0), and passes through (−π/2, −1) and (0, 1). The same rising shape continues past the dashed lines at both edges." title="A repeating curve between dashed vertical lines"/>
+            <wp:docPr id="1" name="graph1" descr="A repeating curve between dashed vertical lines, with four labeled points. Plotted data: dashed vertical lines at x = −3π/4, π/4, and 5π/4, spaced π apart. Between each pair of neighboring dashed lines, the curve rises from the bottom of the grid to the top, getting very close to the dashed lines at both ends. It crosses the x-axis at (−π/4, 0) and (3π/4, 0), and passes through (−π/2, −1) and (0, 1). The same rising shape continues past the dashed lines at both edges." title="A repeating curve between dashed vertical lines, with four labeled points"/>
             <wp:cNvGraphicFramePr>
               <a:graphicFrameLocks xmlns:a="http://schemas.openxmlformats.org/drawingml/2006/main" noChangeAspect="1"/>
             </wp:cNvGraphicFramePr>
@@ -2073,7 +2123,7 @@
                   <pic:spPr bwMode="auto">
                     <a:xfrm>
                       <a:off x="0" y="0"/>
-                      <a:ext cx="3609975" cy="2476500"/>
+                      <a:ext cx="3676650" cy="2476500"/>
                     </a:xfrm>
                     <a:prstGeom prst="rect">
                       <a:avLst/>
@@ -2402,9 +2452,9 @@
       <w:r>
         <w:drawing>
           <wp:inline distT="0" distB="0" distL="0" distR="0">
-            <wp:extent cx="2514600" cy="2476500"/>
+            <wp:extent cx="2571750" cy="2476500"/>
             <wp:effectExtent t="0" r="0" b="0" l="0"/>
-            <wp:docPr id="1" name="graph2" descr="U-shaped pieces between dashed vertical lines. Plotted data: dashed vertical lines at x = −π, −π/2, 0, π/2, and π, spaced π/2 apart. Between each pair of neighboring dashed lines is one U-shaped piece whose ends climb toward the dashed lines. From left to right the pieces alternate: a U opening upward with lowest point (−3π/4, 1), a U opening downward with highest point (−π/4, −1), a U opening upward with lowest point (π/4, 1), and a U opening downward with highest point (3π/4, −1). No part of the curve lies strictly between y = −1 and y = 1." title="U-shaped pieces between dashed vertical lines"/>
+            <wp:docPr id="1" name="graph2" descr="U-shaped pieces between dashed vertical lines, with four labeled points. Plotted data: dashed vertical lines at x = −π, −π/2, 0, π/2, and π, spaced π/2 apart. Between each pair of neighboring dashed lines is one U-shaped piece. Each upward U climbs toward the dashed lines at both ends, and each downward U drops toward them. From left to right the pieces alternate: a U opening upward with lowest point (−3π/4, 1), a U opening downward with highest point (−π/4, −1), a U opening upward with lowest point (π/4, 1), and a U opening downward with highest point (3π/4, −1). No part of the curve lies strictly between y = −1 and y = 1." title="U-shaped pieces between dashed vertical lines, with four labeled points"/>
             <wp:cNvGraphicFramePr>
               <a:graphicFrameLocks xmlns:a="http://schemas.openxmlformats.org/drawingml/2006/main" noChangeAspect="1"/>
             </wp:cNvGraphicFramePr>
@@ -2427,7 +2477,7 @@
                   <pic:spPr bwMode="auto">
                     <a:xfrm>
                       <a:off x="0" y="0"/>
-                      <a:ext cx="2514600" cy="2476500"/>
+                      <a:ext cx="2571750" cy="2476500"/>
                     </a:xfrm>
                     <a:prstGeom prst="rect">
                       <a:avLst/>
@@ -2458,7 +2508,7 @@
           <w:sz w:val="22"/>
           <w:szCs w:val="22"/>
         </w:rPr>
-        <w:t xml:space="preserve">dashed vertical lines at x = −π, −π/2, 0, π/2, and π, spaced π/2 apart. Between each pair of neighboring dashed lines is one U-shaped piece whose ends climb toward the dashed lines. From left to right the pieces alternate: a U opening upward with lowest point (−3π/4, 1), a U opening downward with highest point (−π/4, −1), a U opening upward with lowest point (π/4, 1), and a U opening downward with highest point (3π/4, −1). No part of the curve lies strictly between y = −1 and y = 1.</w:t>
+        <w:t xml:space="preserve">dashed vertical lines at x = −π, −π/2, 0, π/2, and π, spaced π/2 apart. Between each pair of neighboring dashed lines is one U-shaped piece. Each upward U climbs toward the dashed lines at both ends, and each downward U drops toward them. From left to right the pieces alternate: a U opening upward with lowest point (−3π/4, 1), a U opening downward with highest point (−π/4, −1), a U opening upward with lowest point (π/4, 1), and a U opening downward with highest point (3π/4, −1). No part of the curve lies strictly between y = −1 and y = 1.</w:t>
       </w:r>
     </w:p>
     <w:p>
@@ -2725,7 +2775,27 @@
         <w:t xml:space="preserve">−1</w:t>
       </w:r>
       <w:r>
-        <w:t xml:space="preserve">. </w:t>
+        <w:t xml:space="preserve">. Cosecant of one half </w:t>
+      </w:r>
+      <w:r>
+        <w:rPr>
+          <w:i/>
+          <w:iCs/>
+        </w:rPr>
+        <w:t xml:space="preserve">x</w:t>
+      </w:r>
+      <w:r>
+        <w:t xml:space="preserve"> would have dashed lines </w:t>
+      </w:r>
+      <w:r>
+        <w:rPr>
+          <w:i/>
+          <w:iCs/>
+        </w:rPr>
+        <w:t xml:space="preserve">2π</w:t>
+      </w:r>
+      <w:r>
+        <w:t xml:space="preserve"> apart. </w:t>
       </w:r>
       <w:r>
         <w:rPr>
@@ -2783,9 +2853,9 @@
       <w:r>
         <w:drawing>
           <wp:inline distT="0" distB="0" distL="0" distR="0">
-            <wp:extent cx="3600450" cy="2476500"/>
+            <wp:extent cx="3657600" cy="2476500"/>
             <wp:effectExtent t="0" r="0" b="0" l="0"/>
-            <wp:docPr id="1" name="graph3" descr="U-shaped pieces between dashed vertical lines, with two labeled points. Plotted data: dashed vertical lines at x = −3π/4, π/4, and 5π/4, spaced π apart. Between −3π/4 and π/4 is a U opening upward with lowest point (−π/4, 1). Between π/4 and 5π/4 is a U opening downward with highest point (3π/4, −1). Pieces of the same shapes continue past the dashed lines at both edges. No part of the curve lies strictly between y = −1 and y = 1." title="U-shaped pieces between dashed vertical lines, with two labeled points"/>
+            <wp:docPr id="1" name="graph3" descr="U-shaped pieces between dashed vertical lines, with two labeled points. Plotted data: dashed vertical lines at x = −3π/4, π/4, and 5π/4, spaced π apart. Between −3π/4 and π/4 is a U opening upward with lowest point (−π/4, 1). Between π/4 and 5π/4 is a U opening downward with highest point (3π/4, −1). At the left edge, left of −3π/4, part of a downward U reaches −1 at x = −5π/4. At the right edge, right of 5π/4, part of an upward U reaches 1 at x = 7π/4. No part of the curve lies strictly between y = −1 and y = 1." title="U-shaped pieces between dashed vertical lines, with two labeled points"/>
             <wp:cNvGraphicFramePr>
               <a:graphicFrameLocks xmlns:a="http://schemas.openxmlformats.org/drawingml/2006/main" noChangeAspect="1"/>
             </wp:cNvGraphicFramePr>
@@ -2808,7 +2878,7 @@
                   <pic:spPr bwMode="auto">
                     <a:xfrm>
                       <a:off x="0" y="0"/>
-                      <a:ext cx="3600450" cy="2476500"/>
+                      <a:ext cx="3657600" cy="2476500"/>
                     </a:xfrm>
                     <a:prstGeom prst="rect">
                       <a:avLst/>
@@ -2839,7 +2909,7 @@
           <w:sz w:val="22"/>
           <w:szCs w:val="22"/>
         </w:rPr>
-        <w:t xml:space="preserve">dashed vertical lines at x = −3π/4, π/4, and 5π/4, spaced π apart. Between −3π/4 and π/4 is a U opening upward with lowest point (−π/4, 1). Between π/4 and 5π/4 is a U opening downward with highest point (3π/4, −1). Pieces of the same shapes continue past the dashed lines at both edges. No part of the curve lies strictly between y = −1 and y = 1.</w:t>
+        <w:t xml:space="preserve">dashed vertical lines at x = −3π/4, π/4, and 5π/4, spaced π apart. Between −3π/4 and π/4 is a U opening upward with lowest point (−π/4, 1). Between π/4 and 5π/4 is a U opening downward with highest point (3π/4, −1). At the left edge, left of −3π/4, part of a downward U reaches −1 at x = −5π/4. At the right edge, right of 5π/4, part of an upward U reaches 1 at x = 7π/4. No part of the curve lies strictly between y = −1 and y = 1.</w:t>
       </w:r>
     </w:p>
     <w:p>
@@ -3095,7 +3165,27 @@
         <w:t xml:space="preserve">(−π/2)=−1</w:t>
       </w:r>
       <w:r>
-        <w:t xml:space="preserve">. </w:t>
+        <w:t xml:space="preserve">. Secant of </w:t>
+      </w:r>
+      <w:r>
+        <w:rPr>
+          <w:i/>
+          <w:iCs/>
+        </w:rPr>
+        <w:t xml:space="preserve">x−π/4</w:t>
+      </w:r>
+      <w:r>
+        <w:t xml:space="preserve"> and cosecant of </w:t>
+      </w:r>
+      <w:r>
+        <w:rPr>
+          <w:i/>
+          <w:iCs/>
+        </w:rPr>
+        <w:t xml:space="preserve">x+π/4</w:t>
+      </w:r>
+      <w:r>
+        <w:t xml:space="preserve"> put the dashed lines elsewhere. </w:t>
       </w:r>
       <w:r>
         <w:rPr>
@@ -3153,7 +3243,7 @@
       <w:r>
         <w:drawing>
           <wp:inline distT="0" distB="0" distL="0" distR="0">
-            <wp:extent cx="4676775" cy="2476500"/>
+            <wp:extent cx="3676650" cy="2476500"/>
             <wp:effectExtent t="0" r="0" b="0" l="0"/>
             <wp:docPr id="1" name="graph4" descr="A repeating curve between dashed vertical lines, with three labeled points. Plotted data: dashed vertical lines at x = −π and x = π, spaced 2π apart. Between them the curve falls from the top of the grid near x = −π to the bottom near x = π, passing through (−π/2, 1), (0, 0), and (π/2, −1). The same falling shape appears to the left of −π and to the right of π." title="A repeating curve between dashed vertical lines, with three labeled points"/>
             <wp:cNvGraphicFramePr>
@@ -3178,7 +3268,7 @@
                   <pic:spPr bwMode="auto">
                     <a:xfrm>
                       <a:off x="0" y="0"/>
-                      <a:ext cx="4676775" cy="2476500"/>
+                      <a:ext cx="3676650" cy="2476500"/>
                     </a:xfrm>
                     <a:prstGeom prst="rect">
                       <a:avLst/>
@@ -3426,7 +3516,37 @@
         <w:t xml:space="preserve">x/2</w:t>
       </w:r>
       <w:r>
-        <w:t xml:space="preserve"> would have a dashed line at 0 instead. But the curve falls, while tangent rises, so the graph is flipped: there is a minus sign. Check: </w:t>
+        <w:t xml:space="preserve"> would have a dashed line at 0 instead, and </w:t>
+      </w:r>
+      <w:r>
+        <w:rPr>
+          <w:i/>
+          <w:iCs/>
+        </w:rPr>
+        <w:t xml:space="preserve">−</w:t>
+      </w:r>
+      <w:r>
+        <w:t xml:space="preserve">tan</w:t>
+      </w:r>
+      <w:r>
+        <w:rPr>
+          <w:i/>
+          <w:iCs/>
+        </w:rPr>
+        <w:t xml:space="preserve">(2x)</w:t>
+      </w:r>
+      <w:r>
+        <w:t xml:space="preserve"> would have dashed lines only </w:t>
+      </w:r>
+      <w:r>
+        <w:rPr>
+          <w:i/>
+          <w:iCs/>
+        </w:rPr>
+        <w:t xml:space="preserve">π/2</w:t>
+      </w:r>
+      <w:r>
+        <w:t xml:space="preserve"> apart. But the curve falls, while tangent rises, so the graph is flipped: there is a minus sign. Check: </w:t>
       </w:r>
       <w:r>
         <w:rPr>
@@ -4004,7 +4124,17 @@
           <w:i/>
           <w:iCs/>
         </w:rPr>
-        <w:t xml:space="preserve">x=−π/4+kπ</w:t>
+        <w:t xml:space="preserve">−π/4</w:t>
+      </w:r>
+      <w:r>
+        <w:t xml:space="preserve"> plus any multiple of </w:t>
+      </w:r>
+      <w:r>
+        <w:rPr>
+          <w:i/>
+          <w:iCs/>
+        </w:rPr>
+        <w:t xml:space="preserve">π</w:t>
       </w:r>
       <w:r>
         <w:t xml:space="preserve">. What is the mistake, if any?</w:t>
@@ -4255,7 +4385,17 @@
           <w:i/>
           <w:iCs/>
         </w:rPr>
-        <w:t xml:space="preserve">x=π/6+(kπ)/3</w:t>
+        <w:t xml:space="preserve">π/6</w:t>
+      </w:r>
+      <w:r>
+        <w:t xml:space="preserve"> plus any multiple of </w:t>
+      </w:r>
+      <w:r>
+        <w:rPr>
+          <w:i/>
+          <w:iCs/>
+        </w:rPr>
+        <w:t xml:space="preserve">π/3</w:t>
       </w:r>
       <w:r>
         <w:t xml:space="preserve">, so the period is </w:t>
@@ -4516,7 +4656,17 @@
           <w:i/>
           <w:iCs/>
         </w:rPr>
-        <w:t xml:space="preserve">x=π+2kπ</w:t>
+        <w:t xml:space="preserve">π</w:t>
+      </w:r>
+      <w:r>
+        <w:t xml:space="preserve"> plus any multiple of </w:t>
+      </w:r>
+      <w:r>
+        <w:rPr>
+          <w:i/>
+          <w:iCs/>
+        </w:rPr>
+        <w:t xml:space="preserve">2π</w:t>
       </w:r>
       <w:r>
         <w:t xml:space="preserve">, and the domain is every real number except those. What is the mistake, if any?</w:t>

</xml_diff>

<commit_message>
PF2: match CheckIt notation (negative inside, shift written first) and add a notation-reading item
Co-Authored-By: Claude Opus 5.5 <noreply@anthropic.com>
Claude-Session: https://claude.ai/code/session_013Y8PfETWcMLvmUEpCdE8Wq
</commit_message>
<xml_diff>
--- a/support-materials/PF2/PF2_worked_examples.docx
+++ b/support-materials/PF2/PF2_worked_examples.docx
@@ -795,7 +795,7 @@
           <w:sz w:val="40"/>
           <w:szCs w:val="40"/>
         </w:rPr>
-        <w:t xml:space="preserve">f(x)=−</w:t>
+        <w:t xml:space="preserve">f(x)=</w:t>
       </w:r>
       <w:r>
         <w:rPr>
@@ -811,7 +811,7 @@
           <w:sz w:val="40"/>
           <w:szCs w:val="40"/>
         </w:rPr>
-        <w:t xml:space="preserve">(2x)</w:t>
+        <w:t xml:space="preserve">(−2x)</w:t>
       </w:r>
     </w:p>
     <w:p>
@@ -945,7 +945,27 @@
         <w:t xml:space="preserve">π/2</w:t>
       </w:r>
       <w:r>
-        <w:t xml:space="preserve">. The minus sign in front flips the graph upside down. It does not change the period or move the asymptotes, which are at </w:t>
+        <w:t xml:space="preserve">. The negative sign inside flips the graph upside down, the same as </w:t>
+      </w:r>
+      <w:r>
+        <w:rPr>
+          <w:i/>
+          <w:iCs/>
+        </w:rPr>
+        <w:t xml:space="preserve">−</w:t>
+      </w:r>
+      <w:r>
+        <w:t xml:space="preserve">cot</w:t>
+      </w:r>
+      <w:r>
+        <w:rPr>
+          <w:i/>
+          <w:iCs/>
+        </w:rPr>
+        <w:t xml:space="preserve">(2x)</w:t>
+      </w:r>
+      <w:r>
+        <w:t xml:space="preserve">. It does not change the period or move the asymptotes, which are at </w:t>
       </w:r>
       <w:r>
         <w:rPr>
@@ -955,7 +975,7 @@
         <w:t xml:space="preserve">x=(kπ)/2</w:t>
       </w:r>
       <w:r>
-        <w:t xml:space="preserve">. The answer </w:t>
+        <w:t xml:space="preserve">. Only the size of the number matters for the period. The answer </w:t>
       </w:r>
       <w:r>
         <w:rPr>
@@ -1007,7 +1027,7 @@
         <w:pageBreakBefore/>
       </w:pPr>
       <w:r>
-        <w:t xml:space="preserve">Example 5: Domain 1</w:t>
+        <w:t xml:space="preserve">Example 5: Reading the Notation</w:t>
       </w:r>
     </w:p>
     <w:p>
@@ -1022,14 +1042,14 @@
           <w:sz w:val="40"/>
           <w:szCs w:val="40"/>
         </w:rPr>
-        <w:t xml:space="preserve">f(x)=</w:t>
+        <w:t xml:space="preserve">g(x)=</w:t>
       </w:r>
       <w:r>
         <w:rPr>
           <w:sz w:val="40"/>
           <w:szCs w:val="40"/>
         </w:rPr>
-        <w:t xml:space="preserve">tan</w:t>
+        <w:t xml:space="preserve">sec</w:t>
       </w:r>
       <w:r>
         <w:rPr>
@@ -1038,7 +1058,7 @@
           <w:sz w:val="40"/>
           <w:szCs w:val="40"/>
         </w:rPr>
-        <w:t xml:space="preserve">(2x)</w:t>
+        <w:t xml:space="preserve">(−3/2π+x)</w:t>
       </w:r>
     </w:p>
     <w:p>
@@ -1055,7 +1075,7 @@
         <w:spacing w:after="120" w:before="80" w:line="300"/>
       </w:pPr>
       <w:r>
-        <w:t xml:space="preserve">What is the domain of this function?</w:t>
+        <w:t xml:space="preserve">CheckIt sometimes writes the shift first, like this. Which function is the same?</w:t>
       </w:r>
     </w:p>
     <w:p>
@@ -1075,7 +1095,17 @@
           <w:i/>
           <w:iCs/>
         </w:rPr>
-        <w:t xml:space="preserve">…∪(−π/2,π/2)∪(π/2,(3π)/2)∪…</w:t>
+        <w:t xml:space="preserve">g(x)=</w:t>
+      </w:r>
+      <w:r>
+        <w:t xml:space="preserve">sec</w:t>
+      </w:r>
+      <w:r>
+        <w:rPr>
+          <w:i/>
+          <w:iCs/>
+        </w:rPr>
+        <w:t xml:space="preserve">(x+(3π)/2)</w:t>
       </w:r>
     </w:p>
     <w:p>
@@ -1095,7 +1125,17 @@
           <w:i/>
           <w:iCs/>
         </w:rPr>
-        <w:t xml:space="preserve">…∪(−π/4,π/4)∪(π/4,(3π)/4)∪…</w:t>
+        <w:t xml:space="preserve">g(x)=</w:t>
+      </w:r>
+      <w:r>
+        <w:t xml:space="preserve">sec</w:t>
+      </w:r>
+      <w:r>
+        <w:rPr>
+          <w:i/>
+          <w:iCs/>
+        </w:rPr>
+        <w:t xml:space="preserve">(−(3π)/2x)</w:t>
       </w:r>
     </w:p>
     <w:p>
@@ -1115,7 +1155,17 @@
           <w:i/>
           <w:iCs/>
         </w:rPr>
-        <w:t xml:space="preserve">…∪(0,π/2)∪(π/2,π)∪…</w:t>
+        <w:t xml:space="preserve">g(x)=</w:t>
+      </w:r>
+      <w:r>
+        <w:t xml:space="preserve">sec</w:t>
+      </w:r>
+      <w:r>
+        <w:rPr>
+          <w:i/>
+          <w:iCs/>
+        </w:rPr>
+        <w:t xml:space="preserve">(x−(3π)/2)</w:t>
       </w:r>
     </w:p>
     <w:p>
@@ -1135,7 +1185,17 @@
           <w:i/>
           <w:iCs/>
         </w:rPr>
-        <w:t xml:space="preserve">(−∞,∞)</w:t>
+        <w:t xml:space="preserve">g(x)=</w:t>
+      </w:r>
+      <w:r>
+        <w:t xml:space="preserve">sec</w:t>
+      </w:r>
+      <w:r>
+        <w:rPr>
+          <w:i/>
+          <w:iCs/>
+        </w:rPr>
+        <w:t xml:space="preserve">(x)−(3π)/2</w:t>
       </w:r>
     </w:p>
     <w:p>
@@ -1152,135 +1212,126 @@
         <w:spacing w:after="120" w:before="80" w:line="300"/>
       </w:pPr>
       <w:r>
-        <w:t xml:space="preserve">The asymptotes are where </w:t>
-      </w:r>
-      <w:r>
-        <w:rPr>
-          <w:i/>
-          <w:iCs/>
-        </w:rPr>
-        <w:t xml:space="preserve">2x=π/2+kπ</w:t>
-      </w:r>
-      <w:r>
-        <w:t xml:space="preserve">, so </w:t>
-      </w:r>
-      <w:r>
-        <w:rPr>
-          <w:i/>
-          <w:iCs/>
-        </w:rPr>
-        <w:t xml:space="preserve">x=π/4+(kπ)/2</w:t>
-      </w:r>
-      <w:r>
-        <w:t xml:space="preserve">: at </w:t>
-      </w:r>
-      <w:r>
-        <w:rPr>
-          <w:i/>
-          <w:iCs/>
-        </w:rPr>
-        <w:t xml:space="preserve">−π/4</w:t>
-      </w:r>
-      <w:r>
-        <w:t xml:space="preserve">, </w:t>
-      </w:r>
-      <w:r>
-        <w:rPr>
-          <w:i/>
-          <w:iCs/>
-        </w:rPr>
-        <w:t xml:space="preserve">π/4</w:t>
-      </w:r>
-      <w:r>
-        <w:t xml:space="preserve">, </w:t>
-      </w:r>
-      <w:r>
-        <w:rPr>
-          <w:i/>
-          <w:iCs/>
-        </w:rPr>
-        <w:t xml:space="preserve">(3π)/4</w:t>
-      </w:r>
-      <w:r>
-        <w:t xml:space="preserve">, and so on. The domain is the open intervals between them. The intervals around </w:t>
-      </w:r>
-      <w:r>
-        <w:rPr>
-          <w:i/>
-          <w:iCs/>
-        </w:rPr>
-        <w:t xml:space="preserve">π/2</w:t>
-      </w:r>
-      <w:r>
-        <w:t xml:space="preserve"> ignore the 2. The intervals starting at 0 belong to </w:t>
-      </w:r>
-      <w:r>
-        <w:t xml:space="preserve">cot</w:t>
-      </w:r>
-      <w:r>
-        <w:rPr>
-          <w:i/>
-          <w:iCs/>
-        </w:rPr>
-        <w:t xml:space="preserve">(2x)</w:t>
-      </w:r>
-      <w:r>
-        <w:t xml:space="preserve">. All real numbers is the range, not the domain. </w:t>
-      </w:r>
-      <w:r>
-        <w:rPr>
-          <w:b/>
-          <w:bCs/>
-        </w:rPr>
-        <w:t xml:space="preserve">The domain is the open intervals between </w:t>
-      </w:r>
-      <w:r>
-        <w:rPr>
-          <w:b/>
-          <w:bCs/>
-          <w:i/>
-          <w:iCs/>
-        </w:rPr>
-        <w:t xml:space="preserve">−π/4</w:t>
-      </w:r>
-      <w:r>
-        <w:rPr>
-          <w:b/>
-          <w:bCs/>
-        </w:rPr>
-        <w:t xml:space="preserve">, </w:t>
-      </w:r>
-      <w:r>
-        <w:rPr>
-          <w:b/>
-          <w:bCs/>
-          <w:i/>
-          <w:iCs/>
-        </w:rPr>
-        <w:t xml:space="preserve">π/4</w:t>
-      </w:r>
-      <w:r>
-        <w:rPr>
-          <w:b/>
-          <w:bCs/>
-        </w:rPr>
-        <w:t xml:space="preserve">, </w:t>
-      </w:r>
-      <w:r>
-        <w:rPr>
-          <w:b/>
-          <w:bCs/>
-          <w:i/>
-          <w:iCs/>
-        </w:rPr>
-        <w:t xml:space="preserve">(3π)/4</w:t>
-      </w:r>
-      <w:r>
-        <w:rPr>
-          <w:b/>
-          <w:bCs/>
-        </w:rPr>
-        <w:t xml:space="preserve">, and so on.</w:t>
+        <w:t xml:space="preserve">The input is negative three halves of </w:t>
+      </w:r>
+      <w:r>
+        <w:rPr>
+          <w:i/>
+          <w:iCs/>
+        </w:rPr>
+        <w:t xml:space="preserve">π</w:t>
+      </w:r>
+      <w:r>
+        <w:t xml:space="preserve">, plus </w:t>
+      </w:r>
+      <w:r>
+        <w:rPr>
+          <w:i/>
+          <w:iCs/>
+        </w:rPr>
+        <w:t xml:space="preserve">x</w:t>
+      </w:r>
+      <w:r>
+        <w:t xml:space="preserve">. Adding can be done in either order, so it is the same as </w:t>
+      </w:r>
+      <w:r>
+        <w:rPr>
+          <w:i/>
+          <w:iCs/>
+        </w:rPr>
+        <w:t xml:space="preserve">x−(3π)/2</w:t>
+      </w:r>
+      <w:r>
+        <w:t xml:space="preserve">. The </w:t>
+      </w:r>
+      <w:r>
+        <w:rPr>
+          <w:i/>
+          <w:iCs/>
+        </w:rPr>
+        <w:t xml:space="preserve">x</w:t>
+      </w:r>
+      <w:r>
+        <w:t xml:space="preserve"> is added to the number, not multiplied by it. The number is subtracted, so the graph shifts right by </w:t>
+      </w:r>
+      <w:r>
+        <w:rPr>
+          <w:i/>
+          <w:iCs/>
+        </w:rPr>
+        <w:t xml:space="preserve">(3π)/2</w:t>
+      </w:r>
+      <w:r>
+        <w:t xml:space="preserve">. For the asymptotes, solve </w:t>
+      </w:r>
+      <w:r>
+        <w:rPr>
+          <w:i/>
+          <w:iCs/>
+        </w:rPr>
+        <w:t xml:space="preserve">x−(3π)/2=π/2+kπ</w:t>
+      </w:r>
+      <w:r>
+        <w:t xml:space="preserve">: </w:t>
+      </w:r>
+      <w:r>
+        <w:rPr>
+          <w:i/>
+          <w:iCs/>
+        </w:rPr>
+        <w:t xml:space="preserve">x=2π+kπ</w:t>
+      </w:r>
+      <w:r>
+        <w:t xml:space="preserve">, which is every multiple of </w:t>
+      </w:r>
+      <w:r>
+        <w:rPr>
+          <w:i/>
+          <w:iCs/>
+        </w:rPr>
+        <w:t xml:space="preserve">π</w:t>
+      </w:r>
+      <w:r>
+        <w:t xml:space="preserve">. </w:t>
+      </w:r>
+      <w:r>
+        <w:rPr>
+          <w:b/>
+          <w:bCs/>
+        </w:rPr>
+        <w:t xml:space="preserve">It is the same as </w:t>
+      </w:r>
+      <w:r>
+        <w:rPr>
+          <w:b/>
+          <w:bCs/>
+          <w:i/>
+          <w:iCs/>
+        </w:rPr>
+        <w:t xml:space="preserve">g(x)=</w:t>
+      </w:r>
+      <w:r>
+        <w:rPr>
+          <w:b/>
+          <w:bCs/>
+        </w:rPr>
+        <w:t xml:space="preserve">sec</w:t>
+      </w:r>
+      <w:r>
+        <w:rPr>
+          <w:b/>
+          <w:bCs/>
+          <w:i/>
+          <w:iCs/>
+        </w:rPr>
+        <w:t xml:space="preserve">(x−(3π)/2)</w:t>
+      </w:r>
+      <w:r>
+        <w:rPr>
+          <w:b/>
+          <w:bCs/>
+        </w:rPr>
+        <w:t xml:space="preserve">.</w:t>
       </w:r>
     </w:p>
     <w:p>
@@ -1289,7 +1340,7 @@
         <w:pageBreakBefore/>
       </w:pPr>
       <w:r>
-        <w:t xml:space="preserve">Example 6: Range 1</w:t>
+        <w:t xml:space="preserve">Example 6: Domain 1</w:t>
       </w:r>
     </w:p>
     <w:p>
@@ -1304,14 +1355,14 @@
           <w:sz w:val="40"/>
           <w:szCs w:val="40"/>
         </w:rPr>
-        <w:t xml:space="preserve">g(x)=</w:t>
+        <w:t xml:space="preserve">f(x)=</w:t>
       </w:r>
       <w:r>
         <w:rPr>
           <w:sz w:val="40"/>
           <w:szCs w:val="40"/>
         </w:rPr>
-        <w:t xml:space="preserve">sec</w:t>
+        <w:t xml:space="preserve">tan</w:t>
       </w:r>
       <w:r>
         <w:rPr>
@@ -1320,7 +1371,7 @@
           <w:sz w:val="40"/>
           <w:szCs w:val="40"/>
         </w:rPr>
-        <w:t xml:space="preserve">(x−π/4)</w:t>
+        <w:t xml:space="preserve">(2x)</w:t>
       </w:r>
     </w:p>
     <w:p>
@@ -1337,7 +1388,7 @@
         <w:spacing w:after="120" w:before="80" w:line="300"/>
       </w:pPr>
       <w:r>
-        <w:t xml:space="preserve">What is the range of this function?</w:t>
+        <w:t xml:space="preserve">What is the domain of this function?</w:t>
       </w:r>
     </w:p>
     <w:p>
@@ -1357,67 +1408,67 @@
           <w:i/>
           <w:iCs/>
         </w:rPr>
+        <w:t xml:space="preserve">…∪(−π/2,π/2)∪(π/2,(3π)/2)∪…</w:t>
+      </w:r>
+    </w:p>
+    <w:p>
+      <w:pPr>
+        <w:spacing w:after="40" w:before="20"/>
+        <w:ind w:left="360"/>
+      </w:pPr>
+      <w:r>
+        <w:rPr>
+          <w:b/>
+          <w:bCs/>
+        </w:rPr>
+        <w:t xml:space="preserve">B.  </w:t>
+      </w:r>
+      <w:r>
+        <w:rPr>
+          <w:i/>
+          <w:iCs/>
+        </w:rPr>
+        <w:t xml:space="preserve">…∪(−π/4,π/4)∪(π/4,(3π)/4)∪…</w:t>
+      </w:r>
+    </w:p>
+    <w:p>
+      <w:pPr>
+        <w:spacing w:after="40" w:before="20"/>
+        <w:ind w:left="360"/>
+      </w:pPr>
+      <w:r>
+        <w:rPr>
+          <w:b/>
+          <w:bCs/>
+        </w:rPr>
+        <w:t xml:space="preserve">C.  </w:t>
+      </w:r>
+      <w:r>
+        <w:rPr>
+          <w:i/>
+          <w:iCs/>
+        </w:rPr>
+        <w:t xml:space="preserve">…∪(0,π/2)∪(π/2,π)∪…</w:t>
+      </w:r>
+    </w:p>
+    <w:p>
+      <w:pPr>
+        <w:spacing w:after="40" w:before="20"/>
+        <w:ind w:left="360"/>
+      </w:pPr>
+      <w:r>
+        <w:rPr>
+          <w:b/>
+          <w:bCs/>
+        </w:rPr>
+        <w:t xml:space="preserve">D.  </w:t>
+      </w:r>
+      <w:r>
+        <w:rPr>
+          <w:i/>
+          <w:iCs/>
+        </w:rPr>
         <w:t xml:space="preserve">(−∞,∞)</w:t>
-      </w:r>
-    </w:p>
-    <w:p>
-      <w:pPr>
-        <w:spacing w:after="40" w:before="20"/>
-        <w:ind w:left="360"/>
-      </w:pPr>
-      <w:r>
-        <w:rPr>
-          <w:b/>
-          <w:bCs/>
-        </w:rPr>
-        <w:t xml:space="preserve">B.  </w:t>
-      </w:r>
-      <w:r>
-        <w:rPr>
-          <w:i/>
-          <w:iCs/>
-        </w:rPr>
-        <w:t xml:space="preserve">[−1,1]</w:t>
-      </w:r>
-    </w:p>
-    <w:p>
-      <w:pPr>
-        <w:spacing w:after="40" w:before="20"/>
-        <w:ind w:left="360"/>
-      </w:pPr>
-      <w:r>
-        <w:rPr>
-          <w:b/>
-          <w:bCs/>
-        </w:rPr>
-        <w:t xml:space="preserve">C.  </w:t>
-      </w:r>
-      <w:r>
-        <w:rPr>
-          <w:i/>
-          <w:iCs/>
-        </w:rPr>
-        <w:t xml:space="preserve">(−∞,−1]∪[1,∞)</w:t>
-      </w:r>
-    </w:p>
-    <w:p>
-      <w:pPr>
-        <w:spacing w:after="40" w:before="20"/>
-        <w:ind w:left="360"/>
-      </w:pPr>
-      <w:r>
-        <w:rPr>
-          <w:b/>
-          <w:bCs/>
-        </w:rPr>
-        <w:t xml:space="preserve">D.  </w:t>
-      </w:r>
-      <w:r>
-        <w:rPr>
-          <w:i/>
-          <w:iCs/>
-        </w:rPr>
-        <w:t xml:space="preserve">(−∞,−1)∪(1,∞)</w:t>
       </w:r>
     </w:p>
     <w:p>
@@ -1434,64 +1485,135 @@
         <w:spacing w:after="120" w:before="80" w:line="300"/>
       </w:pPr>
       <w:r>
-        <w:t xml:space="preserve">A shift moves the graph left or right, which never changes the range. Secant is 1 divided by cosine, and cosine stays between </w:t>
-      </w:r>
-      <w:r>
-        <w:rPr>
-          <w:i/>
-          <w:iCs/>
-        </w:rPr>
-        <w:t xml:space="preserve">−1</w:t>
-      </w:r>
-      <w:r>
-        <w:t xml:space="preserve"> and </w:t>
-      </w:r>
-      <w:r>
-        <w:rPr>
-          <w:i/>
-          <w:iCs/>
-        </w:rPr>
-        <w:t xml:space="preserve">1</w:t>
-      </w:r>
-      <w:r>
-        <w:t xml:space="preserve">, so secant is always at least 1 or at most </w:t>
-      </w:r>
-      <w:r>
-        <w:rPr>
-          <w:i/>
-          <w:iCs/>
-        </w:rPr>
-        <w:t xml:space="preserve">−1</w:t>
-      </w:r>
-      <w:r>
-        <w:t xml:space="preserve">. It reaches exactly 1 and </w:t>
-      </w:r>
-      <w:r>
-        <w:rPr>
-          <w:i/>
-          <w:iCs/>
-        </w:rPr>
-        <w:t xml:space="preserve">−1</w:t>
-      </w:r>
-      <w:r>
-        <w:t xml:space="preserve"> at the turning points of each branch, so those ends are included with square brackets. The interval </w:t>
-      </w:r>
-      <w:r>
-        <w:rPr>
-          <w:i/>
-          <w:iCs/>
-        </w:rPr>
-        <w:t xml:space="preserve">[−1,1]</w:t>
-      </w:r>
-      <w:r>
-        <w:t xml:space="preserve"> is the range of cosine. </w:t>
-      </w:r>
-      <w:r>
-        <w:rPr>
-          <w:b/>
-          <w:bCs/>
-        </w:rPr>
-        <w:t xml:space="preserve">The range is everything at or above 1 together with everything at or below negative 1.</w:t>
+        <w:t xml:space="preserve">The asymptotes are where </w:t>
+      </w:r>
+      <w:r>
+        <w:rPr>
+          <w:i/>
+          <w:iCs/>
+        </w:rPr>
+        <w:t xml:space="preserve">2x=π/2+kπ</w:t>
+      </w:r>
+      <w:r>
+        <w:t xml:space="preserve">, so </w:t>
+      </w:r>
+      <w:r>
+        <w:rPr>
+          <w:i/>
+          <w:iCs/>
+        </w:rPr>
+        <w:t xml:space="preserve">x=π/4+(kπ)/2</w:t>
+      </w:r>
+      <w:r>
+        <w:t xml:space="preserve">: at </w:t>
+      </w:r>
+      <w:r>
+        <w:rPr>
+          <w:i/>
+          <w:iCs/>
+        </w:rPr>
+        <w:t xml:space="preserve">−π/4</w:t>
+      </w:r>
+      <w:r>
+        <w:t xml:space="preserve">, </w:t>
+      </w:r>
+      <w:r>
+        <w:rPr>
+          <w:i/>
+          <w:iCs/>
+        </w:rPr>
+        <w:t xml:space="preserve">π/4</w:t>
+      </w:r>
+      <w:r>
+        <w:t xml:space="preserve">, </w:t>
+      </w:r>
+      <w:r>
+        <w:rPr>
+          <w:i/>
+          <w:iCs/>
+        </w:rPr>
+        <w:t xml:space="preserve">(3π)/4</w:t>
+      </w:r>
+      <w:r>
+        <w:t xml:space="preserve">, and so on. The domain is the open intervals between them. The intervals around </w:t>
+      </w:r>
+      <w:r>
+        <w:rPr>
+          <w:i/>
+          <w:iCs/>
+        </w:rPr>
+        <w:t xml:space="preserve">π/2</w:t>
+      </w:r>
+      <w:r>
+        <w:t xml:space="preserve"> ignore the 2. The intervals starting at 0 belong to </w:t>
+      </w:r>
+      <w:r>
+        <w:t xml:space="preserve">cot</w:t>
+      </w:r>
+      <w:r>
+        <w:rPr>
+          <w:i/>
+          <w:iCs/>
+        </w:rPr>
+        <w:t xml:space="preserve">(2x)</w:t>
+      </w:r>
+      <w:r>
+        <w:t xml:space="preserve">. All real numbers is the range, not the domain. </w:t>
+      </w:r>
+      <w:r>
+        <w:rPr>
+          <w:b/>
+          <w:bCs/>
+        </w:rPr>
+        <w:t xml:space="preserve">The domain is the open intervals between </w:t>
+      </w:r>
+      <w:r>
+        <w:rPr>
+          <w:b/>
+          <w:bCs/>
+          <w:i/>
+          <w:iCs/>
+        </w:rPr>
+        <w:t xml:space="preserve">−π/4</w:t>
+      </w:r>
+      <w:r>
+        <w:rPr>
+          <w:b/>
+          <w:bCs/>
+        </w:rPr>
+        <w:t xml:space="preserve">, </w:t>
+      </w:r>
+      <w:r>
+        <w:rPr>
+          <w:b/>
+          <w:bCs/>
+          <w:i/>
+          <w:iCs/>
+        </w:rPr>
+        <w:t xml:space="preserve">π/4</w:t>
+      </w:r>
+      <w:r>
+        <w:rPr>
+          <w:b/>
+          <w:bCs/>
+        </w:rPr>
+        <w:t xml:space="preserve">, </w:t>
+      </w:r>
+      <w:r>
+        <w:rPr>
+          <w:b/>
+          <w:bCs/>
+          <w:i/>
+          <w:iCs/>
+        </w:rPr>
+        <w:t xml:space="preserve">(3π)/4</w:t>
+      </w:r>
+      <w:r>
+        <w:rPr>
+          <w:b/>
+          <w:bCs/>
+        </w:rPr>
+        <w:t xml:space="preserve">, and so on.</w:t>
       </w:r>
     </w:p>
     <w:p>
@@ -1500,7 +1622,7 @@
         <w:pageBreakBefore/>
       </w:pPr>
       <w:r>
-        <w:t xml:space="preserve">Example 7: Domain 2</w:t>
+        <w:t xml:space="preserve">Example 7: Range 1</w:t>
       </w:r>
     </w:p>
     <w:p>
@@ -1515,14 +1637,14 @@
           <w:sz w:val="40"/>
           <w:szCs w:val="40"/>
         </w:rPr>
-        <w:t xml:space="preserve">h(x)=</w:t>
+        <w:t xml:space="preserve">g(x)=</w:t>
       </w:r>
       <w:r>
         <w:rPr>
           <w:sz w:val="40"/>
           <w:szCs w:val="40"/>
         </w:rPr>
-        <w:t xml:space="preserve">cot</w:t>
+        <w:t xml:space="preserve">sec</w:t>
       </w:r>
       <w:r>
         <w:rPr>
@@ -1531,7 +1653,7 @@
           <w:sz w:val="40"/>
           <w:szCs w:val="40"/>
         </w:rPr>
-        <w:t xml:space="preserve">(1/3x)</w:t>
+        <w:t xml:space="preserve">(x−π/4)</w:t>
       </w:r>
     </w:p>
     <w:p>
@@ -1548,7 +1670,7 @@
         <w:spacing w:after="120" w:before="80" w:line="300"/>
       </w:pPr>
       <w:r>
-        <w:t xml:space="preserve">What is the domain of this function?</w:t>
+        <w:t xml:space="preserve">What is the range of this function?</w:t>
       </w:r>
     </w:p>
     <w:p>
@@ -1568,7 +1690,7 @@
           <w:i/>
           <w:iCs/>
         </w:rPr>
-        <w:t xml:space="preserve">…∪(−3π,0)∪(0,3π)∪…</w:t>
+        <w:t xml:space="preserve">(−∞,∞)</w:t>
       </w:r>
     </w:p>
     <w:p>
@@ -1588,7 +1710,7 @@
           <w:i/>
           <w:iCs/>
         </w:rPr>
-        <w:t xml:space="preserve">…∪(−π/3,0)∪(0,π/3)∪…</w:t>
+        <w:t xml:space="preserve">[−1,1]</w:t>
       </w:r>
     </w:p>
     <w:p>
@@ -1608,7 +1730,7 @@
           <w:i/>
           <w:iCs/>
         </w:rPr>
-        <w:t xml:space="preserve">…∪(−(3π)/2,(3π)/2)∪((3π)/2,(9π)/2)∪…</w:t>
+        <w:t xml:space="preserve">(−∞,−1]∪[1,∞)</w:t>
       </w:r>
     </w:p>
     <w:p>
@@ -1628,7 +1750,7 @@
           <w:i/>
           <w:iCs/>
         </w:rPr>
-        <w:t xml:space="preserve">…∪(−π,0)∪(0,π)∪…</w:t>
+        <w:t xml:space="preserve">(−∞,−1)∪(1,∞)</w:t>
       </w:r>
     </w:p>
     <w:p>
@@ -1645,152 +1767,64 @@
         <w:spacing w:after="120" w:before="80" w:line="300"/>
       </w:pPr>
       <w:r>
-        <w:t xml:space="preserve">Cotangent breaks where its input is </w:t>
-      </w:r>
-      <w:r>
-        <w:rPr>
-          <w:i/>
-          <w:iCs/>
-        </w:rPr>
-        <w:t xml:space="preserve">kπ</w:t>
-      </w:r>
-      <w:r>
-        <w:t xml:space="preserve">. Set </w:t>
-      </w:r>
-      <w:r>
-        <w:rPr>
-          <w:i/>
-          <w:iCs/>
-        </w:rPr>
-        <w:t xml:space="preserve">x/3=kπ</w:t>
-      </w:r>
-      <w:r>
-        <w:t xml:space="preserve"> and multiply by 3: </w:t>
-      </w:r>
-      <w:r>
-        <w:rPr>
-          <w:i/>
-          <w:iCs/>
-        </w:rPr>
-        <w:t xml:space="preserve">x=3kπ</w:t>
-      </w:r>
-      <w:r>
-        <w:t xml:space="preserve">, so the asymptotes are at </w:t>
-      </w:r>
-      <w:r>
-        <w:rPr>
-          <w:i/>
-          <w:iCs/>
-        </w:rPr>
-        <w:t xml:space="preserve">−3π</w:t>
-      </w:r>
-      <w:r>
-        <w:t xml:space="preserve">, </w:t>
-      </w:r>
-      <w:r>
-        <w:rPr>
-          <w:i/>
-          <w:iCs/>
-        </w:rPr>
-        <w:t xml:space="preserve">0</w:t>
-      </w:r>
-      <w:r>
-        <w:t xml:space="preserve">, </w:t>
-      </w:r>
-      <w:r>
-        <w:rPr>
-          <w:i/>
-          <w:iCs/>
-        </w:rPr>
-        <w:t xml:space="preserve">3π</w:t>
-      </w:r>
-      <w:r>
-        <w:t xml:space="preserve">, and so on. The intervals with </w:t>
-      </w:r>
-      <w:r>
-        <w:rPr>
-          <w:i/>
-          <w:iCs/>
-        </w:rPr>
-        <w:t xml:space="preserve">π/3</w:t>
-      </w:r>
-      <w:r>
-        <w:t xml:space="preserve"> divide by 3 instead of multiplying. The intervals ending at </w:t>
-      </w:r>
-      <w:r>
-        <w:rPr>
-          <w:i/>
-          <w:iCs/>
-        </w:rPr>
-        <w:t xml:space="preserve">(3π)/2</w:t>
-      </w:r>
-      <w:r>
-        <w:t xml:space="preserve"> use tangent's asymptotes, and the intervals at </w:t>
-      </w:r>
-      <w:r>
-        <w:rPr>
-          <w:i/>
-          <w:iCs/>
-        </w:rPr>
-        <w:t xml:space="preserve">π</w:t>
-      </w:r>
-      <w:r>
-        <w:t xml:space="preserve"> ignore the one third. </w:t>
-      </w:r>
-      <w:r>
-        <w:rPr>
-          <w:b/>
-          <w:bCs/>
-        </w:rPr>
-        <w:t xml:space="preserve">The domain is the open intervals between </w:t>
-      </w:r>
-      <w:r>
-        <w:rPr>
-          <w:b/>
-          <w:bCs/>
-          <w:i/>
-          <w:iCs/>
-        </w:rPr>
-        <w:t xml:space="preserve">−3π</w:t>
-      </w:r>
-      <w:r>
-        <w:rPr>
-          <w:b/>
-          <w:bCs/>
-        </w:rPr>
-        <w:t xml:space="preserve">, </w:t>
-      </w:r>
-      <w:r>
-        <w:rPr>
-          <w:b/>
-          <w:bCs/>
-          <w:i/>
-          <w:iCs/>
-        </w:rPr>
-        <w:t xml:space="preserve">0</w:t>
-      </w:r>
-      <w:r>
-        <w:rPr>
-          <w:b/>
-          <w:bCs/>
-        </w:rPr>
-        <w:t xml:space="preserve">, </w:t>
-      </w:r>
-      <w:r>
-        <w:rPr>
-          <w:b/>
-          <w:bCs/>
-          <w:i/>
-          <w:iCs/>
-        </w:rPr>
-        <w:t xml:space="preserve">3π</w:t>
-      </w:r>
-      <w:r>
-        <w:rPr>
-          <w:b/>
-          <w:bCs/>
-        </w:rPr>
-        <w:t xml:space="preserve">, and so on.</w:t>
+        <w:t xml:space="preserve">A shift moves the graph left or right, which never changes the range. Secant is 1 divided by cosine, and cosine stays between </w:t>
+      </w:r>
+      <w:r>
+        <w:rPr>
+          <w:i/>
+          <w:iCs/>
+        </w:rPr>
+        <w:t xml:space="preserve">−1</w:t>
+      </w:r>
+      <w:r>
+        <w:t xml:space="preserve"> and </w:t>
+      </w:r>
+      <w:r>
+        <w:rPr>
+          <w:i/>
+          <w:iCs/>
+        </w:rPr>
+        <w:t xml:space="preserve">1</w:t>
+      </w:r>
+      <w:r>
+        <w:t xml:space="preserve">, so secant is always at least 1 or at most </w:t>
+      </w:r>
+      <w:r>
+        <w:rPr>
+          <w:i/>
+          <w:iCs/>
+        </w:rPr>
+        <w:t xml:space="preserve">−1</w:t>
+      </w:r>
+      <w:r>
+        <w:t xml:space="preserve">. It reaches exactly 1 and </w:t>
+      </w:r>
+      <w:r>
+        <w:rPr>
+          <w:i/>
+          <w:iCs/>
+        </w:rPr>
+        <w:t xml:space="preserve">−1</w:t>
+      </w:r>
+      <w:r>
+        <w:t xml:space="preserve"> at the turning points of each branch, so those ends are included with square brackets. The interval </w:t>
+      </w:r>
+      <w:r>
+        <w:rPr>
+          <w:i/>
+          <w:iCs/>
+        </w:rPr>
+        <w:t xml:space="preserve">[−1,1]</w:t>
+      </w:r>
+      <w:r>
+        <w:t xml:space="preserve"> is the range of cosine. </w:t>
+      </w:r>
+      <w:r>
+        <w:rPr>
+          <w:b/>
+          <w:bCs/>
+        </w:rPr>
+        <w:t xml:space="preserve">The range is everything at or above 1 together with everything at or below negative 1.</w:t>
       </w:r>
     </w:p>
     <w:p>
@@ -1799,7 +1833,7 @@
         <w:pageBreakBefore/>
       </w:pPr>
       <w:r>
-        <w:t xml:space="preserve">Example 8: Domain 3</w:t>
+        <w:t xml:space="preserve">Example 8: Domain 2</w:t>
       </w:r>
     </w:p>
     <w:p>
@@ -1814,14 +1848,14 @@
           <w:sz w:val="40"/>
           <w:szCs w:val="40"/>
         </w:rPr>
-        <w:t xml:space="preserve">f(x)=</w:t>
+        <w:t xml:space="preserve">h(x)=</w:t>
       </w:r>
       <w:r>
         <w:rPr>
           <w:sz w:val="40"/>
           <w:szCs w:val="40"/>
         </w:rPr>
-        <w:t xml:space="preserve">tan</w:t>
+        <w:t xml:space="preserve">cot</w:t>
       </w:r>
       <w:r>
         <w:rPr>
@@ -1830,7 +1864,7 @@
           <w:sz w:val="40"/>
           <w:szCs w:val="40"/>
         </w:rPr>
-        <w:t xml:space="preserve">(x+(3π)/4)</w:t>
+        <w:t xml:space="preserve">(1/3x)</w:t>
       </w:r>
     </w:p>
     <w:p>
@@ -1867,7 +1901,7 @@
           <w:i/>
           <w:iCs/>
         </w:rPr>
-        <w:t xml:space="preserve">…∪(π/4,(5π)/4)∪((5π)/4,(9π)/4)∪…</w:t>
+        <w:t xml:space="preserve">…∪(−3π,0)∪(0,3π)∪…</w:t>
       </w:r>
     </w:p>
     <w:p>
@@ -1887,7 +1921,7 @@
           <w:i/>
           <w:iCs/>
         </w:rPr>
-        <w:t xml:space="preserve">…∪(−π/2,π/2)∪(π/2,(3π)/2)∪…</w:t>
+        <w:t xml:space="preserve">…∪(−π/3,0)∪(0,π/3)∪…</w:t>
       </w:r>
     </w:p>
     <w:p>
@@ -1907,7 +1941,7 @@
           <w:i/>
           <w:iCs/>
         </w:rPr>
-        <w:t xml:space="preserve">…∪(−π/4,(3π)/4)∪((3π)/4,(7π)/4)∪…</w:t>
+        <w:t xml:space="preserve">…∪(−(3π)/2,(3π)/2)∪((3π)/2,(9π)/2)∪…</w:t>
       </w:r>
     </w:p>
     <w:p>
@@ -1944,34 +1978,44 @@
         <w:spacing w:after="120" w:before="80" w:line="300"/>
       </w:pPr>
       <w:r>
-        <w:t xml:space="preserve">Set </w:t>
-      </w:r>
-      <w:r>
-        <w:rPr>
-          <w:i/>
-          <w:iCs/>
-        </w:rPr>
-        <w:t xml:space="preserve">x+(3π)/4=π/2+kπ</w:t>
-      </w:r>
-      <w:r>
-        <w:t xml:space="preserve"> and subtract: </w:t>
-      </w:r>
-      <w:r>
-        <w:rPr>
-          <w:i/>
-          <w:iCs/>
-        </w:rPr>
-        <w:t xml:space="preserve">x=−π/4+kπ</w:t>
-      </w:r>
-      <w:r>
-        <w:t xml:space="preserve">. So the asymptotes are at </w:t>
-      </w:r>
-      <w:r>
-        <w:rPr>
-          <w:i/>
-          <w:iCs/>
-        </w:rPr>
-        <w:t xml:space="preserve">−π/4</w:t>
+        <w:t xml:space="preserve">Cotangent breaks where its input is </w:t>
+      </w:r>
+      <w:r>
+        <w:rPr>
+          <w:i/>
+          <w:iCs/>
+        </w:rPr>
+        <w:t xml:space="preserve">kπ</w:t>
+      </w:r>
+      <w:r>
+        <w:t xml:space="preserve">. Set </w:t>
+      </w:r>
+      <w:r>
+        <w:rPr>
+          <w:i/>
+          <w:iCs/>
+        </w:rPr>
+        <w:t xml:space="preserve">x/3=kπ</w:t>
+      </w:r>
+      <w:r>
+        <w:t xml:space="preserve"> and multiply by 3: </w:t>
+      </w:r>
+      <w:r>
+        <w:rPr>
+          <w:i/>
+          <w:iCs/>
+        </w:rPr>
+        <w:t xml:space="preserve">x=3kπ</w:t>
+      </w:r>
+      <w:r>
+        <w:t xml:space="preserve">, so the asymptotes are at </w:t>
+      </w:r>
+      <w:r>
+        <w:rPr>
+          <w:i/>
+          <w:iCs/>
+        </w:rPr>
+        <w:t xml:space="preserve">−3π</w:t>
       </w:r>
       <w:r>
         <w:t xml:space="preserve">, </w:t>
@@ -1981,7 +2025,7 @@
           <w:i/>
           <w:iCs/>
         </w:rPr>
-        <w:t xml:space="preserve">(3π)/4</w:t>
+        <w:t xml:space="preserve">0</w:t>
       </w:r>
       <w:r>
         <w:t xml:space="preserve">, </w:t>
@@ -1991,30 +2035,30 @@
           <w:i/>
           <w:iCs/>
         </w:rPr>
-        <w:t xml:space="preserve">(7π)/4</w:t>
-      </w:r>
-      <w:r>
-        <w:t xml:space="preserve">, and so on. The intervals starting at </w:t>
-      </w:r>
-      <w:r>
-        <w:rPr>
-          <w:i/>
-          <w:iCs/>
-        </w:rPr>
-        <w:t xml:space="preserve">π/4</w:t>
-      </w:r>
-      <w:r>
-        <w:t xml:space="preserve"> shift the wrong way, to the right. The intervals around </w:t>
-      </w:r>
-      <w:r>
-        <w:rPr>
-          <w:i/>
-          <w:iCs/>
-        </w:rPr>
-        <w:t xml:space="preserve">π/2</w:t>
-      </w:r>
-      <w:r>
-        <w:t xml:space="preserve"> ignore the shift, and the intervals at </w:t>
+        <w:t xml:space="preserve">3π</w:t>
+      </w:r>
+      <w:r>
+        <w:t xml:space="preserve">, and so on. The intervals with </w:t>
+      </w:r>
+      <w:r>
+        <w:rPr>
+          <w:i/>
+          <w:iCs/>
+        </w:rPr>
+        <w:t xml:space="preserve">π/3</w:t>
+      </w:r>
+      <w:r>
+        <w:t xml:space="preserve"> divide by 3 instead of multiplying. The intervals ending at </w:t>
+      </w:r>
+      <w:r>
+        <w:rPr>
+          <w:i/>
+          <w:iCs/>
+        </w:rPr>
+        <w:t xml:space="preserve">(3π)/2</w:t>
+      </w:r>
+      <w:r>
+        <w:t xml:space="preserve"> use tangent's asymptotes, and the intervals at </w:t>
       </w:r>
       <w:r>
         <w:rPr>
@@ -2024,7 +2068,7 @@
         <w:t xml:space="preserve">π</w:t>
       </w:r>
       <w:r>
-        <w:t xml:space="preserve"> use cotangent's asymptotes. </w:t>
+        <w:t xml:space="preserve"> ignore the one third. </w:t>
       </w:r>
       <w:r>
         <w:rPr>
@@ -2040,7 +2084,7 @@
           <w:i/>
           <w:iCs/>
         </w:rPr>
-        <w:t xml:space="preserve">−π/4</w:t>
+        <w:t xml:space="preserve">−3π</w:t>
       </w:r>
       <w:r>
         <w:rPr>
@@ -2056,7 +2100,7 @@
           <w:i/>
           <w:iCs/>
         </w:rPr>
-        <w:t xml:space="preserve">(3π)/4</w:t>
+        <w:t xml:space="preserve">0</w:t>
       </w:r>
       <w:r>
         <w:rPr>
@@ -2072,7 +2116,7 @@
           <w:i/>
           <w:iCs/>
         </w:rPr>
-        <w:t xml:space="preserve">(7π)/4</w:t>
+        <w:t xml:space="preserve">3π</w:t>
       </w:r>
       <w:r>
         <w:rPr>
@@ -2088,7 +2132,296 @@
         <w:pageBreakBefore/>
       </w:pPr>
       <w:r>
-        <w:t xml:space="preserve">Example 9: Graph 1</w:t>
+        <w:t xml:space="preserve">Example 9: Domain 3</w:t>
+      </w:r>
+    </w:p>
+    <w:p>
+      <w:pPr>
+        <w:spacing w:after="200" w:before="200"/>
+        <w:jc w:val="center"/>
+      </w:pPr>
+      <w:r>
+        <w:rPr>
+          <w:i/>
+          <w:iCs/>
+          <w:sz w:val="40"/>
+          <w:szCs w:val="40"/>
+        </w:rPr>
+        <w:t xml:space="preserve">f(x)=</w:t>
+      </w:r>
+      <w:r>
+        <w:rPr>
+          <w:sz w:val="40"/>
+          <w:szCs w:val="40"/>
+        </w:rPr>
+        <w:t xml:space="preserve">tan</w:t>
+      </w:r>
+      <w:r>
+        <w:rPr>
+          <w:i/>
+          <w:iCs/>
+          <w:sz w:val="40"/>
+          <w:szCs w:val="40"/>
+        </w:rPr>
+        <w:t xml:space="preserve">(x+(3π)/4)</w:t>
+      </w:r>
+    </w:p>
+    <w:p>
+      <w:pPr>
+        <w:pStyle w:val="Heading3"/>
+        <w:keepNext/>
+      </w:pPr>
+      <w:r>
+        <w:t xml:space="preserve">Question</w:t>
+      </w:r>
+    </w:p>
+    <w:p>
+      <w:pPr>
+        <w:spacing w:after="120" w:before="80" w:line="300"/>
+      </w:pPr>
+      <w:r>
+        <w:t xml:space="preserve">What is the domain of this function?</w:t>
+      </w:r>
+    </w:p>
+    <w:p>
+      <w:pPr>
+        <w:spacing w:after="40" w:before="20"/>
+        <w:ind w:left="360"/>
+      </w:pPr>
+      <w:r>
+        <w:rPr>
+          <w:b/>
+          <w:bCs/>
+        </w:rPr>
+        <w:t xml:space="preserve">A.  </w:t>
+      </w:r>
+      <w:r>
+        <w:rPr>
+          <w:i/>
+          <w:iCs/>
+        </w:rPr>
+        <w:t xml:space="preserve">…∪(π/4,(5π)/4)∪((5π)/4,(9π)/4)∪…</w:t>
+      </w:r>
+    </w:p>
+    <w:p>
+      <w:pPr>
+        <w:spacing w:after="40" w:before="20"/>
+        <w:ind w:left="360"/>
+      </w:pPr>
+      <w:r>
+        <w:rPr>
+          <w:b/>
+          <w:bCs/>
+        </w:rPr>
+        <w:t xml:space="preserve">B.  </w:t>
+      </w:r>
+      <w:r>
+        <w:rPr>
+          <w:i/>
+          <w:iCs/>
+        </w:rPr>
+        <w:t xml:space="preserve">…∪(−π/2,π/2)∪(π/2,(3π)/2)∪…</w:t>
+      </w:r>
+    </w:p>
+    <w:p>
+      <w:pPr>
+        <w:spacing w:after="40" w:before="20"/>
+        <w:ind w:left="360"/>
+      </w:pPr>
+      <w:r>
+        <w:rPr>
+          <w:b/>
+          <w:bCs/>
+        </w:rPr>
+        <w:t xml:space="preserve">C.  </w:t>
+      </w:r>
+      <w:r>
+        <w:rPr>
+          <w:i/>
+          <w:iCs/>
+        </w:rPr>
+        <w:t xml:space="preserve">…∪(−π/4,(3π)/4)∪((3π)/4,(7π)/4)∪…</w:t>
+      </w:r>
+    </w:p>
+    <w:p>
+      <w:pPr>
+        <w:spacing w:after="40" w:before="20"/>
+        <w:ind w:left="360"/>
+      </w:pPr>
+      <w:r>
+        <w:rPr>
+          <w:b/>
+          <w:bCs/>
+        </w:rPr>
+        <w:t xml:space="preserve">D.  </w:t>
+      </w:r>
+      <w:r>
+        <w:rPr>
+          <w:i/>
+          <w:iCs/>
+        </w:rPr>
+        <w:t xml:space="preserve">…∪(−π,0)∪(0,π)∪…</w:t>
+      </w:r>
+    </w:p>
+    <w:p>
+      <w:pPr>
+        <w:pStyle w:val="Heading3"/>
+        <w:keepNext/>
+      </w:pPr>
+      <w:r>
+        <w:t xml:space="preserve">Answer and reasoning</w:t>
+      </w:r>
+    </w:p>
+    <w:p>
+      <w:pPr>
+        <w:spacing w:after="120" w:before="80" w:line="300"/>
+      </w:pPr>
+      <w:r>
+        <w:t xml:space="preserve">Set </w:t>
+      </w:r>
+      <w:r>
+        <w:rPr>
+          <w:i/>
+          <w:iCs/>
+        </w:rPr>
+        <w:t xml:space="preserve">x+(3π)/4=π/2+kπ</w:t>
+      </w:r>
+      <w:r>
+        <w:t xml:space="preserve"> and subtract: </w:t>
+      </w:r>
+      <w:r>
+        <w:rPr>
+          <w:i/>
+          <w:iCs/>
+        </w:rPr>
+        <w:t xml:space="preserve">x=−π/4+kπ</w:t>
+      </w:r>
+      <w:r>
+        <w:t xml:space="preserve">. So the asymptotes are at </w:t>
+      </w:r>
+      <w:r>
+        <w:rPr>
+          <w:i/>
+          <w:iCs/>
+        </w:rPr>
+        <w:t xml:space="preserve">−π/4</w:t>
+      </w:r>
+      <w:r>
+        <w:t xml:space="preserve">, </w:t>
+      </w:r>
+      <w:r>
+        <w:rPr>
+          <w:i/>
+          <w:iCs/>
+        </w:rPr>
+        <w:t xml:space="preserve">(3π)/4</w:t>
+      </w:r>
+      <w:r>
+        <w:t xml:space="preserve">, </w:t>
+      </w:r>
+      <w:r>
+        <w:rPr>
+          <w:i/>
+          <w:iCs/>
+        </w:rPr>
+        <w:t xml:space="preserve">(7π)/4</w:t>
+      </w:r>
+      <w:r>
+        <w:t xml:space="preserve">, and so on. The intervals starting at </w:t>
+      </w:r>
+      <w:r>
+        <w:rPr>
+          <w:i/>
+          <w:iCs/>
+        </w:rPr>
+        <w:t xml:space="preserve">π/4</w:t>
+      </w:r>
+      <w:r>
+        <w:t xml:space="preserve"> shift the wrong way, to the right. The intervals around </w:t>
+      </w:r>
+      <w:r>
+        <w:rPr>
+          <w:i/>
+          <w:iCs/>
+        </w:rPr>
+        <w:t xml:space="preserve">π/2</w:t>
+      </w:r>
+      <w:r>
+        <w:t xml:space="preserve"> ignore the shift, and the intervals at </w:t>
+      </w:r>
+      <w:r>
+        <w:rPr>
+          <w:i/>
+          <w:iCs/>
+        </w:rPr>
+        <w:t xml:space="preserve">π</w:t>
+      </w:r>
+      <w:r>
+        <w:t xml:space="preserve"> use cotangent's asymptotes. </w:t>
+      </w:r>
+      <w:r>
+        <w:rPr>
+          <w:b/>
+          <w:bCs/>
+        </w:rPr>
+        <w:t xml:space="preserve">The domain is the open intervals between </w:t>
+      </w:r>
+      <w:r>
+        <w:rPr>
+          <w:b/>
+          <w:bCs/>
+          <w:i/>
+          <w:iCs/>
+        </w:rPr>
+        <w:t xml:space="preserve">−π/4</w:t>
+      </w:r>
+      <w:r>
+        <w:rPr>
+          <w:b/>
+          <w:bCs/>
+        </w:rPr>
+        <w:t xml:space="preserve">, </w:t>
+      </w:r>
+      <w:r>
+        <w:rPr>
+          <w:b/>
+          <w:bCs/>
+          <w:i/>
+          <w:iCs/>
+        </w:rPr>
+        <w:t xml:space="preserve">(3π)/4</w:t>
+      </w:r>
+      <w:r>
+        <w:rPr>
+          <w:b/>
+          <w:bCs/>
+        </w:rPr>
+        <w:t xml:space="preserve">, </w:t>
+      </w:r>
+      <w:r>
+        <w:rPr>
+          <w:b/>
+          <w:bCs/>
+          <w:i/>
+          <w:iCs/>
+        </w:rPr>
+        <w:t xml:space="preserve">(7π)/4</w:t>
+      </w:r>
+      <w:r>
+        <w:rPr>
+          <w:b/>
+          <w:bCs/>
+        </w:rPr>
+        <w:t xml:space="preserve">, and so on.</w:t>
+      </w:r>
+    </w:p>
+    <w:p>
+      <w:pPr>
+        <w:pStyle w:val="Heading2"/>
+        <w:pageBreakBefore/>
+      </w:pPr>
+      <w:r>
+        <w:t xml:space="preserve">Example 10: Graph 1</w:t>
       </w:r>
     </w:p>
     <w:p>
@@ -2442,7 +2775,7 @@
         <w:pageBreakBefore/>
       </w:pPr>
       <w:r>
-        <w:t xml:space="preserve">Example 10: Graph 2</w:t>
+        <w:t xml:space="preserve">Example 11: Graph 2</w:t>
       </w:r>
     </w:p>
     <w:p>
@@ -2605,7 +2938,7 @@
           <w:i/>
           <w:iCs/>
         </w:rPr>
-        <w:t xml:space="preserve">f(x)=−</w:t>
+        <w:t xml:space="preserve">f(x)=</w:t>
       </w:r>
       <w:r>
         <w:t xml:space="preserve">csc</w:t>
@@ -2615,7 +2948,7 @@
           <w:i/>
           <w:iCs/>
         </w:rPr>
-        <w:t xml:space="preserve">(2x)</w:t>
+        <w:t xml:space="preserve">(−2x)</w:t>
       </w:r>
     </w:p>
     <w:p>
@@ -2765,7 +3098,17 @@
         <w:t xml:space="preserve">(π/4, 1)</w:t>
       </w:r>
       <w:r>
-        <w:t xml:space="preserve">. With the minus sign in front, that point would be at </w:t>
+        <w:t xml:space="preserve">. With </w:t>
+      </w:r>
+      <w:r>
+        <w:rPr>
+          <w:i/>
+          <w:iCs/>
+        </w:rPr>
+        <w:t xml:space="preserve">−2x</w:t>
+      </w:r>
+      <w:r>
+        <w:t xml:space="preserve"> inside, the graph flips and that point would be at </w:t>
       </w:r>
       <w:r>
         <w:rPr>
@@ -2843,7 +3186,7 @@
         <w:pageBreakBefore/>
       </w:pPr>
       <w:r>
-        <w:t xml:space="preserve">Example 11: Graph 3</w:t>
+        <w:t xml:space="preserve">Example 12: Graph 3</w:t>
       </w:r>
     </w:p>
     <w:p>
@@ -3233,7 +3576,7 @@
         <w:pageBreakBefore/>
       </w:pPr>
       <w:r>
-        <w:t xml:space="preserve">Example 12: Graph 4</w:t>
+        <w:t xml:space="preserve">Example 13: Graph 4</w:t>
       </w:r>
     </w:p>
     <w:p>
@@ -3366,7 +3709,7 @@
           <w:i/>
           <w:iCs/>
         </w:rPr>
-        <w:t xml:space="preserve">f(x)=−</w:t>
+        <w:t xml:space="preserve">f(x)=</w:t>
       </w:r>
       <w:r>
         <w:t xml:space="preserve">tan</w:t>
@@ -3376,7 +3719,7 @@
           <w:i/>
           <w:iCs/>
         </w:rPr>
-        <w:t xml:space="preserve">(1/2x)</w:t>
+        <w:t xml:space="preserve">(−1/2x)</w:t>
       </w:r>
     </w:p>
     <w:p>
@@ -3396,7 +3739,7 @@
           <w:i/>
           <w:iCs/>
         </w:rPr>
-        <w:t xml:space="preserve">f(x)=−</w:t>
+        <w:t xml:space="preserve">f(x)=</w:t>
       </w:r>
       <w:r>
         <w:t xml:space="preserve">tan</w:t>
@@ -3406,7 +3749,7 @@
           <w:i/>
           <w:iCs/>
         </w:rPr>
-        <w:t xml:space="preserve">(2x)</w:t>
+        <w:t xml:space="preserve">(−2x)</w:t>
       </w:r>
     </w:p>
     <w:p>
@@ -3519,6 +3862,52 @@
         <w:t xml:space="preserve"> would have a dashed line at 0 instead, and </w:t>
       </w:r>
       <w:r>
+        <w:t xml:space="preserve">tan</w:t>
+      </w:r>
+      <w:r>
+        <w:rPr>
+          <w:i/>
+          <w:iCs/>
+        </w:rPr>
+        <w:t xml:space="preserve">(−2x)</w:t>
+      </w:r>
+      <w:r>
+        <w:t xml:space="preserve"> would have dashed lines only </w:t>
+      </w:r>
+      <w:r>
+        <w:rPr>
+          <w:i/>
+          <w:iCs/>
+        </w:rPr>
+        <w:t xml:space="preserve">π/2</w:t>
+      </w:r>
+      <w:r>
+        <w:t xml:space="preserve"> apart. But the curve falls, while tangent rises, so the graph is flipped: the number inside is negative. Check: </w:t>
+      </w:r>
+      <w:r>
+        <w:t xml:space="preserve">tan</w:t>
+      </w:r>
+      <w:r>
+        <w:rPr>
+          <w:i/>
+          <w:iCs/>
+        </w:rPr>
+        <w:t xml:space="preserve">(−π/4)=−1</w:t>
+      </w:r>
+      <w:r>
+        <w:t xml:space="preserve"> at </w:t>
+      </w:r>
+      <w:r>
+        <w:rPr>
+          <w:i/>
+          <w:iCs/>
+        </w:rPr>
+        <w:t xml:space="preserve">x=π/2</w:t>
+      </w:r>
+      <w:r>
+        <w:t xml:space="preserve">. This is the same function as </w:t>
+      </w:r>
+      <w:r>
         <w:rPr>
           <w:i/>
           <w:iCs/>
@@ -3533,95 +3922,42 @@
           <w:i/>
           <w:iCs/>
         </w:rPr>
-        <w:t xml:space="preserve">(2x)</w:t>
-      </w:r>
-      <w:r>
-        <w:t xml:space="preserve"> would have dashed lines only </w:t>
-      </w:r>
-      <w:r>
-        <w:rPr>
-          <w:i/>
-          <w:iCs/>
-        </w:rPr>
-        <w:t xml:space="preserve">π/2</w:t>
-      </w:r>
-      <w:r>
-        <w:t xml:space="preserve"> apart. But the curve falls, while tangent rises, so the graph is flipped: there is a minus sign. Check: </w:t>
-      </w:r>
-      <w:r>
-        <w:rPr>
-          <w:i/>
-          <w:iCs/>
-        </w:rPr>
-        <w:t xml:space="preserve">−</w:t>
-      </w:r>
-      <w:r>
+        <w:t xml:space="preserve">(x/2)</w:t>
+      </w:r>
+      <w:r>
+        <w:t xml:space="preserve">. </w:t>
+      </w:r>
+      <w:r>
+        <w:rPr>
+          <w:b/>
+          <w:bCs/>
+        </w:rPr>
+        <w:t xml:space="preserve">The graph is </w:t>
+      </w:r>
+      <w:r>
+        <w:rPr>
+          <w:b/>
+          <w:bCs/>
+          <w:i/>
+          <w:iCs/>
+        </w:rPr>
+        <w:t xml:space="preserve">f(x)=</w:t>
+      </w:r>
+      <w:r>
+        <w:rPr>
+          <w:b/>
+          <w:bCs/>
+        </w:rPr>
         <w:t xml:space="preserve">tan</w:t>
       </w:r>
       <w:r>
         <w:rPr>
-          <w:i/>
-          <w:iCs/>
-        </w:rPr>
-        <w:t xml:space="preserve">(π/4)=−1</w:t>
-      </w:r>
-      <w:r>
-        <w:t xml:space="preserve"> at </w:t>
-      </w:r>
-      <w:r>
-        <w:rPr>
-          <w:i/>
-          <w:iCs/>
-        </w:rPr>
-        <w:t xml:space="preserve">x=π/2</w:t>
-      </w:r>
-      <w:r>
-        <w:t xml:space="preserve">. This is the same function as </w:t>
-      </w:r>
-      <w:r>
-        <w:t xml:space="preserve">tan</w:t>
-      </w:r>
-      <w:r>
-        <w:rPr>
-          <w:i/>
-          <w:iCs/>
-        </w:rPr>
-        <w:t xml:space="preserve">(−x/2)</w:t>
-      </w:r>
-      <w:r>
-        <w:t xml:space="preserve">. </w:t>
-      </w:r>
-      <w:r>
-        <w:rPr>
-          <w:b/>
-          <w:bCs/>
-        </w:rPr>
-        <w:t xml:space="preserve">The graph is </w:t>
-      </w:r>
-      <w:r>
-        <w:rPr>
-          <w:b/>
-          <w:bCs/>
-          <w:i/>
-          <w:iCs/>
-        </w:rPr>
-        <w:t xml:space="preserve">f(x)=−</w:t>
-      </w:r>
-      <w:r>
-        <w:rPr>
-          <w:b/>
-          <w:bCs/>
-        </w:rPr>
-        <w:t xml:space="preserve">tan</w:t>
-      </w:r>
-      <w:r>
-        <w:rPr>
-          <w:b/>
-          <w:bCs/>
-          <w:i/>
-          <w:iCs/>
-        </w:rPr>
-        <w:t xml:space="preserve">(x/2)</w:t>
+          <w:b/>
+          <w:bCs/>
+          <w:i/>
+          <w:iCs/>
+        </w:rPr>
+        <w:t xml:space="preserve">(−1/2x)</w:t>
       </w:r>
       <w:r>
         <w:rPr>
@@ -3637,7 +3973,7 @@
         <w:pageBreakBefore/>
       </w:pPr>
       <w:r>
-        <w:t xml:space="preserve">Example 13: Slip 1</w:t>
+        <w:t xml:space="preserve">Example 14: Slip 1</w:t>
       </w:r>
     </w:p>
     <w:p>
@@ -3858,7 +4194,7 @@
         <w:pageBreakBefore/>
       </w:pPr>
       <w:r>
-        <w:t xml:space="preserve">Example 14: Slip 2</w:t>
+        <w:t xml:space="preserve">Example 15: Slip 2</w:t>
       </w:r>
     </w:p>
     <w:p>
@@ -4069,7 +4405,7 @@
         <w:pageBreakBefore/>
       </w:pPr>
       <w:r>
-        <w:t xml:space="preserve">Example 15: Slip 3</w:t>
+        <w:t xml:space="preserve">Example 16: Slip 3</w:t>
       </w:r>
     </w:p>
     <w:p>
@@ -4330,7 +4666,7 @@
         <w:pageBreakBefore/>
       </w:pPr>
       <w:r>
-        <w:t xml:space="preserve">Example 16: Slip 4</w:t>
+        <w:t xml:space="preserve">Example 17: Slip 4</w:t>
       </w:r>
     </w:p>
     <w:p>
@@ -4601,7 +4937,7 @@
         <w:pageBreakBefore/>
       </w:pPr>
       <w:r>
-        <w:t xml:space="preserve">Example 17: Slip 5</w:t>
+        <w:t xml:space="preserve">Example 18: Slip 5</w:t>
       </w:r>
     </w:p>
     <w:p>

</xml_diff>

<commit_message>
PF2 summary: domain example matches tan(x + pi/4) from the table; stretch rules use the number's size, ignoring a negative sign
Co-Authored-By: Claude Opus 5.5 <noreply@anthropic.com>
Claude-Session: https://claude.ai/code/session_013Y8PfETWcMLvmUEpCdE8Wq
</commit_message>
<xml_diff>
--- a/support-materials/PF2/PF2_worked_examples.docx
+++ b/support-materials/PF2/PF2_worked_examples.docx
@@ -2431,7 +2431,7 @@
       <w:r>
         <w:drawing>
           <wp:inline distT="0" distB="0" distL="0" distR="0">
-            <wp:extent cx="3676650" cy="2476500"/>
+            <wp:extent cx="3657600" cy="2476500"/>
             <wp:effectExtent t="0" r="0" b="0" l="0"/>
             <wp:docPr id="1" name="graph1" descr="A repeating curve between dashed vertical lines, with four labeled points. Plotted data: dashed vertical lines at x = −3π/4, π/4, and 5π/4, spaced π apart. Between each pair of neighboring dashed lines, the curve rises from the bottom of the grid to the top, getting very close to the dashed lines at both ends. It crosses the x-axis at (−π/4, 0) and (3π/4, 0), and passes through (−π/2, −1) and (0, 1). The same rising shape continues past the dashed lines at both edges." title="A repeating curve between dashed vertical lines, with four labeled points"/>
             <wp:cNvGraphicFramePr>
@@ -2456,7 +2456,7 @@
                   <pic:spPr bwMode="auto">
                     <a:xfrm>
                       <a:off x="0" y="0"/>
-                      <a:ext cx="3676650" cy="2476500"/>
+                      <a:ext cx="3657600" cy="2476500"/>
                     </a:xfrm>
                     <a:prstGeom prst="rect">
                       <a:avLst/>
@@ -3196,7 +3196,7 @@
       <w:r>
         <w:drawing>
           <wp:inline distT="0" distB="0" distL="0" distR="0">
-            <wp:extent cx="3657600" cy="2476500"/>
+            <wp:extent cx="3676650" cy="2476500"/>
             <wp:effectExtent t="0" r="0" b="0" l="0"/>
             <wp:docPr id="1" name="graph3" descr="U-shaped pieces between dashed vertical lines, with two labeled points. Plotted data: dashed vertical lines at x = −3π/4, π/4, and 5π/4, spaced π apart. Between −3π/4 and π/4 is a U opening upward with lowest point (−π/4, 1). Between π/4 and 5π/4 is a U opening downward with highest point (3π/4, −1). At the left edge, left of −3π/4, part of a downward U reaches −1 at x = −5π/4. At the right edge, right of 5π/4, part of an upward U reaches 1 at x = 7π/4. No part of the curve lies strictly between y = −1 and y = 1." title="U-shaped pieces between dashed vertical lines, with two labeled points"/>
             <wp:cNvGraphicFramePr>
@@ -3221,7 +3221,7 @@
                   <pic:spPr bwMode="auto">
                     <a:xfrm>
                       <a:off x="0" y="0"/>
-                      <a:ext cx="3657600" cy="2476500"/>
+                      <a:ext cx="3676650" cy="2476500"/>
                     </a:xfrm>
                     <a:prstGeom prst="rect">
                       <a:avLst/>
@@ -3586,7 +3586,7 @@
       <w:r>
         <w:drawing>
           <wp:inline distT="0" distB="0" distL="0" distR="0">
-            <wp:extent cx="3676650" cy="2476500"/>
+            <wp:extent cx="3657600" cy="2476500"/>
             <wp:effectExtent t="0" r="0" b="0" l="0"/>
             <wp:docPr id="1" name="graph4" descr="A repeating curve between dashed vertical lines, with three labeled points. Plotted data: dashed vertical lines at x = −π and x = π, spaced 2π apart. Between them the curve falls from the top of the grid near x = −π to the bottom near x = π, passing through (−π/2, 1), (0, 0), and (π/2, −1). The same falling shape appears to the left of −π and to the right of π." title="A repeating curve between dashed vertical lines, with three labeled points"/>
             <wp:cNvGraphicFramePr>
@@ -3611,7 +3611,7 @@
                   <pic:spPr bwMode="auto">
                     <a:xfrm>
                       <a:off x="0" y="0"/>
-                      <a:ext cx="3676650" cy="2476500"/>
+                      <a:ext cx="3657600" cy="2476500"/>
                     </a:xfrm>
                     <a:prstGeom prst="rect">
                       <a:avLst/>

</xml_diff>